<commit_message>
security: redactar contraseñas en texto plano de la documentacion
El repo paso a publico y la documentacion en docs/ (runbook, demo,
.docx) tenia contraseñas reales de PostgreSQL, pgAdmin y el usuario
admin de la app en texto plano. Se redactan en todos los documentos
(.md, .txt y .docx) y se rotan las tres contraseñas afectadas
directamente en las VMs, dejando inutiles los valores que ya habian
quedado expuestos en el historial de git.

Co-Authored-By: Claude Sonnet 5 <noreply@anthropic.com>
</commit_message>
<xml_diff>
--- a/docs/Runbook_SIGET.docx
+++ b/docs/Runbook_SIGET.docx
@@ -1420,7 +1420,7 @@
           <w:sz w:val="18"/>
           <w:szCs w:val="18"/>
         </w:rPr>
-        <w:t xml:space="preserve">sudo -u postgres psql -c "ALTER USER postgres PASSWORD 'CheckpointCiber5_2026';"</w:t>
+        <w:t xml:space="preserve">sudo -u postgres psql -c "ALTER USER postgres PASSWORD '&lt;PASSWORD_NO_PUBLICADA&gt;';"</w:t>
       </w:r>
       <w:r>
         <w:rPr>
@@ -1604,7 +1604,7 @@
           <w:szCs w:val="18"/>
         </w:rPr>
         <w:br/>
-        <w:t xml:space="preserve">     PGADMIN_SETUP_PASSWORD='CheckpointCiber5_2026' \</w:t>
+        <w:t xml:space="preserve">     PGADMIN_SETUP_PASSWORD='&lt;PASSWORD_NO_PUBLICADA&gt;' \</w:t>
       </w:r>
       <w:r>
         <w:rPr>
@@ -1745,7 +1745,7 @@
         <w:spacing w:after="80"/>
       </w:pPr>
       <w:r>
-        <w:t xml:space="preserve">Login con admin@ciber5.com / CheckpointCiber5_2026</w:t>
+        <w:t xml:space="preserve">Login con admin@ciber5.com / (contraseña no publicada en el repo)</w:t>
       </w:r>
     </w:p>
     <w:p>
@@ -1980,7 +1980,7 @@
           <w:sz w:val="18"/>
           <w:szCs w:val="18"/>
         </w:rPr>
-        <w:t xml:space="preserve">php -r "echo password_hash('Admin123!', PASSWORD_BCRYPT), PHP_EOL;"</w:t>
+        <w:t xml:space="preserve">php -r "echo password_hash('&lt;PASSWORD_NO_PUBLICADA&gt;', PASSWORD_BCRYPT), PHP_EOL;"</w:t>
       </w:r>
       <w:r>
         <w:rPr>
@@ -2218,7 +2218,7 @@
         <w:spacing w:after="80"/>
       </w:pPr>
       <w:r>
-        <w:t xml:space="preserve">Login en http://&lt;IP_NAT_VM1&gt;/gestion/ con admin / Admin123! → acceso concedido al dashboard.</w:t>
+        <w:t xml:space="preserve">Login en http://&lt;IP_NAT_VM1&gt;/gestion/ con admin / (contraseña no publicada en el repo) → acceso concedido al dashboard.</w:t>
       </w:r>
     </w:p>
     <w:p>

</xml_diff>

<commit_message>
docs: regenerar Runbook_SIGET.docx con todo lo hecho hasta ahora
Sincroniza el .docx de entrega formal con docs/runbook.md: agrega
las secciones de crear cuenta/reset de password, rate limiting con
los dos bugs encontrados y corregidos, acceso por port forwarding
(descartado) y la solucion final por Tailscale. Pedido explicito
del profesor de un instructivo con todo lo realizado.

Co-Authored-By: Claude Sonnet 5 <noreply@anthropic.com>
</commit_message>
<xml_diff>
--- a/docs/Runbook_SIGET.docx
+++ b/docs/Runbook_SIGET.docx
@@ -2299,6 +2299,677 @@
       </w:r>
     </w:p>
     <w:p>
+      <w:r>
+        <w:br w:type="page"/>
+      </w:r>
+    </w:p>
+    <w:p>
+      <w:pPr>
+        <w:pStyle w:val="Heading1"/>
+        <w:spacing w:after="200" w:before="400"/>
+      </w:pPr>
+      <w:r>
+        <w:t xml:space="preserve">10.7 Crear cuenta y restablecer contraseña</w:t>
+      </w:r>
+    </w:p>
+    <w:p>
+      <w:pPr>
+        <w:spacing w:after="150"/>
+      </w:pPr>
+      <w:r>
+        <w:t xml:space="preserve">Pedido explícito para que la pantalla de login tenga, además del ingreso con el usuario semilla, las opciones de autorregistro y recuperación de contraseña visibles — el profesor también va a interactuar con esto.</w:t>
+      </w:r>
+    </w:p>
+    <w:p>
+      <w:pPr>
+        <w:spacing w:after="150"/>
+      </w:pPr>
+      <w:r>
+        <w:t xml:space="preserve">Dos archivos nuevos en /var/www/html/gestion/:</w:t>
+      </w:r>
+    </w:p>
+    <w:p>
+      <w:pPr>
+        <w:pBdr>
+          <w:top w:val="single" w:color="CCCCCC" w:sz="2"/>
+          <w:bottom w:val="single" w:color="CCCCCC" w:sz="2"/>
+          <w:left w:val="single" w:color="CCCCCC" w:sz="2"/>
+          <w:right w:val="single" w:color="CCCCCC" w:sz="2"/>
+        </w:pBdr>
+        <w:shd w:fill="F2F2F2" w:val="clear"/>
+        <w:spacing w:after="200" w:before="100"/>
+      </w:pPr>
+      <w:r>
+        <w:rPr>
+          <w:rFonts w:ascii="Consolas" w:cs="Consolas" w:eastAsia="Consolas" w:hAnsi="Consolas"/>
+          <w:sz w:val="18"/>
+          <w:szCs w:val="18"/>
+        </w:rPr>
+        <w:t xml:space="preserve">register.php        → formulario de alta de cuenta: usuario + contraseña + confirmación.</w:t>
+      </w:r>
+      <w:r>
+        <w:rPr>
+          <w:rFonts w:ascii="Consolas" w:cs="Consolas" w:eastAsia="Consolas" w:hAnsi="Consolas"/>
+          <w:sz w:val="18"/>
+          <w:szCs w:val="18"/>
+        </w:rPr>
+        <w:br/>
+        <w:t xml:space="preserve">                       Valida longitud mínima, usuario único, hashea con bcrypt.</w:t>
+      </w:r>
+      <w:r>
+        <w:rPr>
+          <w:rFonts w:ascii="Consolas" w:cs="Consolas" w:eastAsia="Consolas" w:hAnsi="Consolas"/>
+          <w:sz w:val="18"/>
+          <w:szCs w:val="18"/>
+        </w:rPr>
+        <w:br/>
+        <w:t xml:space="preserve">reset-password.php   → restablecimiento directo: usuario + contraseña nueva + confirmación.</w:t>
+      </w:r>
+    </w:p>
+    <w:p>
+      <w:pPr>
+        <w:spacing w:after="150"/>
+      </w:pPr>
+      <w:r>
+        <w:t xml:space="preserve">login.php se actualizó con dos enlaces ("Crear cuenta" / "Olvidé mi contraseña") y mensajes de confirmación después de cada acción.</w:t>
+      </w:r>
+    </w:p>
+    <w:p>
+      <w:pPr>
+        <w:pBdr>
+          <w:left w:val="single" w:color="BF8F00" w:sz="12"/>
+        </w:pBdr>
+        <w:shd w:fill="FFF2CC" w:val="clear"/>
+        <w:spacing w:after="200" w:before="100"/>
+        <w:ind w:left="100"/>
+      </w:pPr>
+      <w:r>
+        <w:rPr>
+          <w:b/>
+          <w:bCs/>
+          <w:color w:val="9C5700"/>
+        </w:rPr>
+        <w:t xml:space="preserve">Nota: </w:t>
+      </w:r>
+      <w:r>
+        <w:rPr>
+          <w:color w:val="9C5700"/>
+        </w:rPr>
+        <w:t xml:space="preserve">Limitación deliberada, documentada en la propia pantalla: reset-password.php NO envía un correo con un enlace de un solo uso, porque el entorno de laboratorio no tiene servidor de correo (SMTP) configurado. El restablecimiento es directo: se pide el usuario y la contraseña nueva en el mismo formulario. En la arquitectura final (Django + email transaccional) esto se reemplaza por un token de un solo uso enviado por correo, con expiración.</w:t>
+      </w:r>
+    </w:p>
+    <w:p>
+      <w:pPr>
+        <w:pBdr>
+          <w:left w:val="single" w:color="BF8F00" w:sz="12"/>
+        </w:pBdr>
+        <w:shd w:fill="FFF2CC" w:val="clear"/>
+        <w:spacing w:after="200" w:before="100"/>
+        <w:ind w:left="100"/>
+      </w:pPr>
+      <w:r>
+        <w:rPr>
+          <w:b/>
+          <w:bCs/>
+          <w:color w:val="9C5700"/>
+        </w:rPr>
+        <w:t xml:space="preserve">Nota: </w:t>
+      </w:r>
+      <w:r>
+        <w:rPr>
+          <w:color w:val="9C5700"/>
+        </w:rPr>
+        <w:t xml:space="preserve">Mitigación de enumeración de usuarios: reset-password.php redirige al mismo mensaje de éxito exista o no el usuario ingresado, para que el formulario no sirva para averiguar qué nombres de usuario están registrados.</w:t>
+      </w:r>
+    </w:p>
+    <w:p>
+      <w:pPr>
+        <w:spacing w:after="150"/>
+      </w:pPr>
+      <w:r>
+        <w:t xml:space="preserve">Verificación end-to-end:</w:t>
+      </w:r>
+    </w:p>
+    <w:p>
+      <w:pPr>
+        <w:pStyle w:val="ListParagraph"/>
+        <w:numPr>
+          <w:ilvl w:val="0"/>
+          <w:numId w:val="2"/>
+        </w:numPr>
+        <w:spacing w:after="80"/>
+      </w:pPr>
+      <w:r>
+        <w:t xml:space="preserve">Se creó una cuenta de prueba desde register.php → verificado con SELECT directo en psql (VM2) que el usuario quedó en app_usuarios.</w:t>
+      </w:r>
+    </w:p>
+    <w:p>
+      <w:pPr>
+        <w:pStyle w:val="ListParagraph"/>
+        <w:numPr>
+          <w:ilvl w:val="0"/>
+          <w:numId w:val="2"/>
+        </w:numPr>
+        <w:spacing w:after="80"/>
+      </w:pPr>
+      <w:r>
+        <w:t xml:space="preserve">Login exitoso con esa cuenta recién creada.</w:t>
+      </w:r>
+    </w:p>
+    <w:p>
+      <w:pPr>
+        <w:pStyle w:val="ListParagraph"/>
+        <w:numPr>
+          <w:ilvl w:val="0"/>
+          <w:numId w:val="2"/>
+        </w:numPr>
+        <w:spacing w:after="80"/>
+      </w:pPr>
+      <w:r>
+        <w:t xml:space="preserve">Se restableció la contraseña de esa cuenta desde reset-password.php.</w:t>
+      </w:r>
+    </w:p>
+    <w:p>
+      <w:pPr>
+        <w:pStyle w:val="ListParagraph"/>
+        <w:numPr>
+          <w:ilvl w:val="0"/>
+          <w:numId w:val="2"/>
+        </w:numPr>
+        <w:spacing w:after="80"/>
+      </w:pPr>
+      <w:r>
+        <w:t xml:space="preserve">Login con la contraseña nueva → éxito. Login con la contraseña vieja → rechazado.</w:t>
+      </w:r>
+    </w:p>
+    <w:p>
+      <w:pPr>
+        <w:pStyle w:val="ListParagraph"/>
+        <w:numPr>
+          <w:ilvl w:val="0"/>
+          <w:numId w:val="2"/>
+        </w:numPr>
+        <w:spacing w:after="80"/>
+      </w:pPr>
+      <w:r>
+        <w:t xml:space="preserve">Cuenta de prueba eliminada al terminar la verificación (dato de testing, no de producto).</w:t>
+      </w:r>
+    </w:p>
+    <w:p>
+      <w:pPr>
+        <w:pStyle w:val="Heading1"/>
+        <w:spacing w:after="200" w:before="400"/>
+      </w:pPr>
+      <w:r>
+        <w:t xml:space="preserve">10.8 Control de acceso: "Acceso denegado" y rate limiting (3 intentos)</w:t>
+      </w:r>
+    </w:p>
+    <w:p>
+      <w:pPr>
+        <w:spacing w:after="150"/>
+      </w:pPr>
+      <w:r>
+        <w:t xml:space="preserve">Pedido explícito: cuando la contraseña es incorrecta, el sistema debe decirlo claramente ("Acceso denegado") y bloquear la cuenta temporalmente tras varios intentos fallidos — protección básica contra fuerza bruta.</w:t>
+      </w:r>
+    </w:p>
+    <w:p>
+      <w:pPr>
+        <w:pStyle w:val="Heading2"/>
+        <w:spacing w:after="150" w:before="300"/>
+      </w:pPr>
+      <w:r>
+        <w:t xml:space="preserve">Cambios en la base de datos (VM2)</w:t>
+      </w:r>
+    </w:p>
+    <w:p>
+      <w:pPr>
+        <w:pBdr>
+          <w:top w:val="single" w:color="CCCCCC" w:sz="2"/>
+          <w:bottom w:val="single" w:color="CCCCCC" w:sz="2"/>
+          <w:left w:val="single" w:color="CCCCCC" w:sz="2"/>
+          <w:right w:val="single" w:color="CCCCCC" w:sz="2"/>
+        </w:pBdr>
+        <w:shd w:fill="F2F2F2" w:val="clear"/>
+        <w:spacing w:after="200" w:before="100"/>
+      </w:pPr>
+      <w:r>
+        <w:rPr>
+          <w:rFonts w:ascii="Consolas" w:cs="Consolas" w:eastAsia="Consolas" w:hAnsi="Consolas"/>
+          <w:sz w:val="18"/>
+          <w:szCs w:val="18"/>
+        </w:rPr>
+        <w:t xml:space="preserve">sudo -u postgres psql -d tramites_demo -c "ALTER TABLE app_usuarios ADD COLUMN IF NOT EXISTS intentos_fallidos INT NOT NULL DEFAULT 0;"</w:t>
+      </w:r>
+      <w:r>
+        <w:rPr>
+          <w:rFonts w:ascii="Consolas" w:cs="Consolas" w:eastAsia="Consolas" w:hAnsi="Consolas"/>
+          <w:sz w:val="18"/>
+          <w:szCs w:val="18"/>
+        </w:rPr>
+        <w:br/>
+        <w:t xml:space="preserve">sudo -u postgres psql -d tramites_demo -c "ALTER TABLE app_usuarios ADD COLUMN IF NOT EXISTS bloqueado_hasta TIMESTAMP NULL;"</w:t>
+      </w:r>
+    </w:p>
+    <w:p>
+      <w:pPr>
+        <w:pStyle w:val="Heading2"/>
+        <w:spacing w:after="150" w:before="300"/>
+      </w:pPr>
+      <w:r>
+        <w:t xml:space="preserve">Lógica en login.php</w:t>
+      </w:r>
+    </w:p>
+    <w:p>
+      <w:pPr>
+        <w:pStyle w:val="ListParagraph"/>
+        <w:numPr>
+          <w:ilvl w:val="0"/>
+          <w:numId w:val="3"/>
+        </w:numPr>
+        <w:spacing w:after="80"/>
+      </w:pPr>
+      <w:r>
+        <w:t xml:space="preserve">Máximo 3 intentos fallidos, bloqueo de 5 minutos.</w:t>
+      </w:r>
+    </w:p>
+    <w:p>
+      <w:pPr>
+        <w:pStyle w:val="ListParagraph"/>
+        <w:numPr>
+          <w:ilvl w:val="0"/>
+          <w:numId w:val="3"/>
+        </w:numPr>
+        <w:spacing w:after="80"/>
+      </w:pPr>
+      <w:r>
+        <w:t xml:space="preserve">Cada intento fallido con un usuario que existe suma 1 y muestra cuántos intentos quedan.</w:t>
+      </w:r>
+    </w:p>
+    <w:p>
+      <w:pPr>
+        <w:pStyle w:val="ListParagraph"/>
+        <w:numPr>
+          <w:ilvl w:val="0"/>
+          <w:numId w:val="3"/>
+        </w:numPr>
+        <w:spacing w:after="80"/>
+      </w:pPr>
+      <w:r>
+        <w:t xml:space="preserve">Al llegar a 3, se guarda bloqueado_hasta = now() + 5 minutos y aparece el mensaje de bloqueo.</w:t>
+      </w:r>
+    </w:p>
+    <w:p>
+      <w:pPr>
+        <w:pStyle w:val="ListParagraph"/>
+        <w:numPr>
+          <w:ilvl w:val="0"/>
+          <w:numId w:val="3"/>
+        </w:numPr>
+        <w:spacing w:after="80"/>
+      </w:pPr>
+      <w:r>
+        <w:t xml:space="preserve">Mientras el bloqueo siga vigente, ni siquiera la contraseña correcta funciona.</w:t>
+      </w:r>
+    </w:p>
+    <w:p>
+      <w:pPr>
+        <w:pStyle w:val="ListParagraph"/>
+        <w:numPr>
+          <w:ilvl w:val="0"/>
+          <w:numId w:val="3"/>
+        </w:numPr>
+        <w:spacing w:after="80"/>
+      </w:pPr>
+      <w:r>
+        <w:t xml:space="preserve">Al vencer el bloqueo, un login exitoso resetea el contador.</w:t>
+      </w:r>
+    </w:p>
+    <w:p>
+      <w:pPr>
+        <w:pStyle w:val="ListParagraph"/>
+        <w:numPr>
+          <w:ilvl w:val="0"/>
+          <w:numId w:val="3"/>
+        </w:numPr>
+        <w:spacing w:after="80"/>
+      </w:pPr>
+      <w:r>
+        <w:t xml:space="preserve">Usuario inexistente: mismo mensaje genérico de "Acceso denegado", sin distinguir si existe o no (evita enumeración de cuentas).</w:t>
+      </w:r>
+    </w:p>
+    <w:p>
+      <w:pPr>
+        <w:pStyle w:val="Heading2"/>
+        <w:spacing w:after="150" w:before="300"/>
+      </w:pPr>
+      <w:r>
+        <w:t xml:space="preserve">Gotcha — dos bugs encontrados y corregidos antes de dar el fix por bueno</w:t>
+      </w:r>
+    </w:p>
+    <w:p>
+      <w:pPr>
+        <w:pStyle w:val="ListParagraph"/>
+        <w:numPr>
+          <w:ilvl w:val="0"/>
+          <w:numId w:val="2"/>
+        </w:numPr>
+        <w:spacing w:after="80"/>
+      </w:pPr>
+      <w:r>
+        <w:t xml:space="preserve">Comparación de fechas hecha en PHP en vez de en la base: la primera versión comparaba con strtotime() en PHP, que interpreta el timestamp con la zona horaria por defecto de PHP — podía no coincidir con la del servidor de PostgreSQL y el bloqueo parecía "ya vencido" apenas se guardaba. Fix: la comparación se movió a la propia consulta SQL (bloqueado_hasta &gt; now()).</w:t>
+      </w:r>
+    </w:p>
+    <w:p>
+      <w:pPr>
+        <w:pStyle w:val="ListParagraph"/>
+        <w:numPr>
+          <w:ilvl w:val="0"/>
+          <w:numId w:val="2"/>
+        </w:numPr>
+        <w:spacing w:after="80"/>
+      </w:pPr>
+      <w:r>
+        <w:t xml:space="preserve">Tipo de dato incorrecto al leer el booleano de Postgres: se esperaba el string 't'/'f', pero PDO_PGSQL en este entorno (PHP 8.3) lo devuelve como bool nativo de PHP — la comparación === 't' era siempre falsa. Se detectó con un script de debug corriendo en el mismo contexto de Apache. Fix: comparar contra true.</w:t>
+      </w:r>
+    </w:p>
+    <w:p>
+      <w:pPr>
+        <w:spacing w:after="150"/>
+      </w:pPr>
+      <w:r>
+        <w:t xml:space="preserve">Verificación end-to-end (tras corregir ambos bugs): 3 intentos fallidos → bloqueo; contraseña correcta durante el bloqueo → rechazada; bloqueo simulado como vencido → login exitoso y contador reseteado.</w:t>
+      </w:r>
+    </w:p>
+    <w:p>
+      <w:pPr>
+        <w:pStyle w:val="Heading1"/>
+        <w:spacing w:after="200" w:before="400"/>
+      </w:pPr>
+      <w:r>
+        <w:t xml:space="preserve">10.9 Acceso desde otras máquinas de la red del aula</w:t>
+      </w:r>
+    </w:p>
+    <w:p>
+      <w:pPr>
+        <w:spacing w:after="150"/>
+      </w:pPr>
+      <w:r>
+        <w:t xml:space="preserve">Pedido explícito: que compañeros y el profesor puedan entrar a la app desde sus propias computadoras, no solo desde la laptop donde corren las VMs.</w:t>
+      </w:r>
+    </w:p>
+    <w:p>
+      <w:pPr>
+        <w:spacing w:after="150"/>
+      </w:pPr>
+      <w:r>
+        <w:t xml:space="preserve">Las VMs solo tienen IP en redes virtuales de VMware, no directamente alcanzables desde la red WiFi del aula. Se evaluó adaptador puenteado (bridged) vs port forwarding por NAT — se eligió port forwarding por menor superficie expuesta.</w:t>
+      </w:r>
+    </w:p>
+    <w:p>
+      <w:pPr>
+        <w:pStyle w:val="Heading2"/>
+        <w:spacing w:after="150" w:before="300"/>
+      </w:pPr>
+      <w:r>
+        <w:t xml:space="preserve">Configuración aplicada</w:t>
+      </w:r>
+    </w:p>
+    <w:p>
+      <w:pPr>
+        <w:pStyle w:val="ListParagraph"/>
+        <w:numPr>
+          <w:ilvl w:val="0"/>
+          <w:numId w:val="2"/>
+        </w:numPr>
+        <w:spacing w:after="80"/>
+      </w:pPr>
+      <w:r>
+        <w:t xml:space="preserve">VMware Workstation Pro → Virtual Network Editor → NAT Settings → Add: puerto de host 8080 (TCP) → 192.168.159.137:80 (VM1). Guardado en C:\ProgramData\VMware\vmnetnat.conf.</w:t>
+      </w:r>
+    </w:p>
+    <w:p>
+      <w:pPr>
+        <w:pStyle w:val="ListParagraph"/>
+        <w:numPr>
+          <w:ilvl w:val="0"/>
+          <w:numId w:val="2"/>
+        </w:numPr>
+        <w:spacing w:after="80"/>
+      </w:pPr>
+      <w:r>
+        <w:t xml:space="preserve">Firewall de Windows: regla de entrada restringida a la subred del aula (no abierta a cualquier IP de internet).</w:t>
+      </w:r>
+    </w:p>
+    <w:p>
+      <w:pPr>
+        <w:pBdr>
+          <w:top w:val="single" w:color="CCCCCC" w:sz="2"/>
+          <w:bottom w:val="single" w:color="CCCCCC" w:sz="2"/>
+          <w:left w:val="single" w:color="CCCCCC" w:sz="2"/>
+          <w:right w:val="single" w:color="CCCCCC" w:sz="2"/>
+        </w:pBdr>
+        <w:shd w:fill="F2F2F2" w:val="clear"/>
+        <w:spacing w:after="200" w:before="100"/>
+      </w:pPr>
+      <w:r>
+        <w:rPr>
+          <w:rFonts w:ascii="Consolas" w:cs="Consolas" w:eastAsia="Consolas" w:hAnsi="Consolas"/>
+          <w:sz w:val="18"/>
+          <w:szCs w:val="18"/>
+        </w:rPr>
+        <w:t xml:space="preserve">New-NetFirewallRule -DisplayName "SIGET app (VM1 port forward)" -Direction Inbound -Protocol TCP -LocalPort 8080 -RemoteAddress 172.29.16.0/20 -Action Allow</w:t>
+      </w:r>
+    </w:p>
+    <w:p>
+      <w:pPr>
+        <w:spacing w:after="150"/>
+      </w:pPr>
+      <w:r>
+        <w:t xml:space="preserve">Verificado con curl desde la IP de la laptop en la WiFi del aula: 200 OK con el título correcto — confirma que el reenvío llega hasta Apache en VM1.</w:t>
+      </w:r>
+    </w:p>
+    <w:p>
+      <w:pPr>
+        <w:pBdr>
+          <w:left w:val="single" w:color="BF8F00" w:sz="12"/>
+        </w:pBdr>
+        <w:shd w:fill="FFF2CC" w:val="clear"/>
+        <w:spacing w:after="200" w:before="100"/>
+        <w:ind w:left="100"/>
+      </w:pPr>
+      <w:r>
+        <w:rPr>
+          <w:b/>
+          <w:bCs/>
+          <w:color w:val="9C5700"/>
+        </w:rPr>
+        <w:t xml:space="preserve">Nota: </w:t>
+      </w:r>
+      <w:r>
+        <w:rPr>
+          <w:color w:val="9C5700"/>
+        </w:rPr>
+        <w:t xml:space="preserve">Intento descartado: se evaluó exponer la app directamente a internet con un túnel rápido de Cloudflare (cloudflared), pero el propio entorno de trabajo bloqueó la ejecución por política de seguridad antes de completarse. Se descartó esta vía en favor de Tailscale.</w:t>
+      </w:r>
+    </w:p>
+    <w:p>
+      <w:pPr>
+        <w:pStyle w:val="Heading1"/>
+        <w:spacing w:after="200" w:before="400"/>
+      </w:pPr>
+      <w:r>
+        <w:t xml:space="preserve">10.9.1 Acceso por Tailscale (solución definitiva de red)</w:t>
+      </w:r>
+    </w:p>
+    <w:p>
+      <w:pPr>
+        <w:spacing w:after="150"/>
+      </w:pPr>
+      <w:r>
+        <w:t xml:space="preserve">El port forwarding por NAT no funcionó para los compañeros — la hipótesis, consistente con la evidencia, es aislamiento de clientes (AP/client isolation) en la red WiFi del aula, común en redes institucionales. Ni el firewall de Windows ni el de la VM estaban bloqueando nada.</w:t>
+      </w:r>
+    </w:p>
+    <w:p>
+      <w:pPr>
+        <w:spacing w:after="150"/>
+      </w:pPr>
+      <w:r>
+        <w:t xml:space="preserve">Solución adoptada: red privada mesh con Tailscale, que no depende del enrutamiento de la red del aula — cada máquina se conecta directo a las demás por un túnel cifrado.</w:t>
+      </w:r>
+    </w:p>
+    <w:p>
+      <w:pPr>
+        <w:pBdr>
+          <w:left w:val="single" w:color="BF8F00" w:sz="12"/>
+        </w:pBdr>
+        <w:shd w:fill="FFF2CC" w:val="clear"/>
+        <w:spacing w:after="200" w:before="100"/>
+        <w:ind w:left="100"/>
+      </w:pPr>
+      <w:r>
+        <w:rPr>
+          <w:b/>
+          <w:bCs/>
+          <w:color w:val="9C5700"/>
+        </w:rPr>
+        <w:t xml:space="preserve">Nota: </w:t>
+      </w:r>
+      <w:r>
+        <w:rPr>
+          <w:color w:val="9C5700"/>
+        </w:rPr>
+        <w:t xml:space="preserve">Importante: la laptop del desarrollador ya tenía Tailscale instalado, pero conectado a una tailnet compartida con otras cuentas y dispositivos ajenos al proyecto. Se decidió explícitamente NO sumar las VMs a esa tailnet y crear una cuenta nueva y dedicada solo al proyecto SIGET.</w:t>
+      </w:r>
+    </w:p>
+    <w:p>
+      <w:pPr>
+        <w:pStyle w:val="Heading2"/>
+        <w:spacing w:after="150" w:before="300"/>
+      </w:pPr>
+      <w:r>
+        <w:t xml:space="preserve">Instalación en VM1 y VM2</w:t>
+      </w:r>
+    </w:p>
+    <w:p>
+      <w:pPr>
+        <w:pBdr>
+          <w:top w:val="single" w:color="CCCCCC" w:sz="2"/>
+          <w:bottom w:val="single" w:color="CCCCCC" w:sz="2"/>
+          <w:left w:val="single" w:color="CCCCCC" w:sz="2"/>
+          <w:right w:val="single" w:color="CCCCCC" w:sz="2"/>
+        </w:pBdr>
+        <w:shd w:fill="F2F2F2" w:val="clear"/>
+        <w:spacing w:after="200" w:before="100"/>
+      </w:pPr>
+      <w:r>
+        <w:rPr>
+          <w:rFonts w:ascii="Consolas" w:cs="Consolas" w:eastAsia="Consolas" w:hAnsi="Consolas"/>
+          <w:sz w:val="18"/>
+          <w:szCs w:val="18"/>
+        </w:rPr>
+        <w:t xml:space="preserve"># En cada VM:</w:t>
+      </w:r>
+      <w:r>
+        <w:rPr>
+          <w:rFonts w:ascii="Consolas" w:cs="Consolas" w:eastAsia="Consolas" w:hAnsi="Consolas"/>
+          <w:sz w:val="18"/>
+          <w:szCs w:val="18"/>
+        </w:rPr>
+        <w:br/>
+        <w:t xml:space="preserve">curl -fsSL https://tailscale.com/install.sh | sh</w:t>
+      </w:r>
+      <w:r>
+        <w:rPr>
+          <w:rFonts w:ascii="Consolas" w:cs="Consolas" w:eastAsia="Consolas" w:hAnsi="Consolas"/>
+          <w:sz w:val="18"/>
+          <w:szCs w:val="18"/>
+        </w:rPr>
+        <w:br/>
+        <w:t xml:space="preserve">sudo tailscale up --auth-key=&lt;AUTH_KEY&gt; --hostname=&lt;nombre-descriptivo&gt;</w:t>
+      </w:r>
+    </w:p>
+    <w:p>
+      <w:pPr>
+        <w:spacing w:after="150"/>
+      </w:pPr>
+      <w:r>
+        <w:t xml:space="preserve">Se usó una auth key (generada desde el panel de la tailnet nueva) para automatizar el alta. --hostname se usó para identificar cada VM claramente (siget-app-backend, siget-db-server).</w:t>
+      </w:r>
+    </w:p>
+    <w:p>
+      <w:pPr>
+        <w:pBdr>
+          <w:left w:val="single" w:color="BF8F00" w:sz="12"/>
+        </w:pBdr>
+        <w:shd w:fill="FFF2CC" w:val="clear"/>
+        <w:spacing w:after="200" w:before="100"/>
+        <w:ind w:left="100"/>
+      </w:pPr>
+      <w:r>
+        <w:rPr>
+          <w:b/>
+          <w:bCs/>
+          <w:color w:val="9C5700"/>
+        </w:rPr>
+        <w:t xml:space="preserve">Nota: </w:t>
+      </w:r>
+      <w:r>
+        <w:rPr>
+          <w:color w:val="9C5700"/>
+        </w:rPr>
+        <w:t xml:space="preserve">Las auth keys usadas se compartieron por chat durante la sesión de trabajo — se recomienda revocarlas/regenerarlas desde el panel de Tailscale después del alta inicial.</w:t>
+      </w:r>
+    </w:p>
+    <w:p>
+      <w:pPr>
+        <w:pStyle w:val="Heading2"/>
+        <w:spacing w:after="150" w:before="300"/>
+      </w:pPr>
+      <w:r>
+        <w:t xml:space="preserve">Verificación de firewall</w:t>
+      </w:r>
+    </w:p>
+    <w:p>
+      <w:pPr>
+        <w:spacing w:after="150"/>
+      </w:pPr>
+      <w:r>
+        <w:t xml:space="preserve">firewalld en ambas VMs asigna la interfaz tailscale0 a la zona por defecto (public), que ya tenía http habilitado sin restricción de origen — el tráfico por Tailscale quedó permitido automáticamente. El firewall de VM2 no se modificó: PostgreSQL sigue aceptando conexiones solo desde 192.168.100.10 (VM1); Tailscale ahí solo habilita SSH/gestión, no expone la base de datos a la tailnet.</w:t>
+      </w:r>
+    </w:p>
+    <w:p>
+      <w:pPr>
+        <w:spacing w:after="150"/>
+      </w:pPr>
+      <w:r>
+        <w:t xml:space="preserve">Verificación end-to-end: 200 OK con el título correcto, probado desde la laptop del desarrollador (en la misma tailnet).</w:t>
+      </w:r>
+    </w:p>
+    <w:p>
+      <w:pPr>
+        <w:pBdr>
+          <w:left w:val="single" w:color="BF8F00" w:sz="12"/>
+        </w:pBdr>
+        <w:shd w:fill="FFF2CC" w:val="clear"/>
+        <w:spacing w:after="200" w:before="100"/>
+        <w:ind w:left="100"/>
+      </w:pPr>
+      <w:r>
+        <w:rPr>
+          <w:b/>
+          <w:bCs/>
+          <w:color w:val="9C5700"/>
+        </w:rPr>
+        <w:t xml:space="preserve">Nota: </w:t>
+      </w:r>
+      <w:r>
+        <w:rPr>
+          <w:color w:val="9C5700"/>
+        </w:rPr>
+        <w:t xml:space="preserve">Acceso definitivo para compañeros/profesor: cada uno se une a la tailnet del proyecto y entra a http://100.104.206.118/gestion/ — esta IP no cambia aunque cambien de red física, a diferencia de la IP de WiFi del port forwarding.</w:t>
+      </w:r>
+    </w:p>
+    <w:p>
       <w:pPr>
         <w:pStyle w:val="Heading1"/>
         <w:spacing w:after="200" w:before="400"/>
@@ -2447,6 +3118,42 @@
                 <w:sz w:val="20"/>
                 <w:szCs w:val="20"/>
               </w:rPr>
+              <w:t xml:space="preserve">VM1 (app-backend) IP Tailscale</w:t>
+            </w:r>
+          </w:p>
+        </w:tc>
+        <w:tc>
+          <w:tcPr>
+            <w:tcW w:type="dxa" w:w="6000"/>
+          </w:tcPr>
+          <w:p>
+            <w:r>
+              <w:rPr>
+                <w:b w:val="false"/>
+                <w:bCs w:val="false"/>
+                <w:color w:val="000000"/>
+                <w:sz w:val="20"/>
+                <w:szCs w:val="20"/>
+              </w:rPr>
+              <w:t xml:space="preserve">100.104.206.118 (siget-app-backend)</w:t>
+            </w:r>
+          </w:p>
+        </w:tc>
+      </w:tr>
+      <w:tr>
+        <w:tc>
+          <w:tcPr>
+            <w:tcW w:type="dxa" w:w="4200"/>
+          </w:tcPr>
+          <w:p>
+            <w:r>
+              <w:rPr>
+                <w:b w:val="false"/>
+                <w:bCs w:val="false"/>
+                <w:color w:val="000000"/>
+                <w:sz w:val="20"/>
+                <w:szCs w:val="20"/>
+              </w:rPr>
               <w:t xml:space="preserve">VM2 (db-server) IP NAT</w:t>
             </w:r>
           </w:p>
@@ -2519,6 +3226,42 @@
                 <w:sz w:val="20"/>
                 <w:szCs w:val="20"/>
               </w:rPr>
+              <w:t xml:space="preserve">VM2 (db-server) IP Tailscale</w:t>
+            </w:r>
+          </w:p>
+        </w:tc>
+        <w:tc>
+          <w:tcPr>
+            <w:tcW w:type="dxa" w:w="6000"/>
+          </w:tcPr>
+          <w:p>
+            <w:r>
+              <w:rPr>
+                <w:b w:val="false"/>
+                <w:bCs w:val="false"/>
+                <w:color w:val="000000"/>
+                <w:sz w:val="20"/>
+                <w:szCs w:val="20"/>
+              </w:rPr>
+              <w:t xml:space="preserve">100.120.115.100 (siget-db-server)</w:t>
+            </w:r>
+          </w:p>
+        </w:tc>
+      </w:tr>
+      <w:tr>
+        <w:tc>
+          <w:tcPr>
+            <w:tcW w:type="dxa" w:w="4200"/>
+          </w:tcPr>
+          <w:p>
+            <w:r>
+              <w:rPr>
+                <w:b w:val="false"/>
+                <w:bCs w:val="false"/>
+                <w:color w:val="000000"/>
+                <w:sz w:val="20"/>
+                <w:szCs w:val="20"/>
+              </w:rPr>
               <w:t xml:space="preserve">Usuario Linux (ambas VMs)</w:t>
             </w:r>
           </w:p>
@@ -2555,7 +3298,43 @@
                 <w:sz w:val="20"/>
                 <w:szCs w:val="20"/>
               </w:rPr>
-              <w:t xml:space="preserve">App de gestión de usuarios (entrega real)</w:t>
+              <w:t xml:space="preserve">App de gestión de usuarios — acceso recomendado (Tailscale)</w:t>
+            </w:r>
+          </w:p>
+        </w:tc>
+        <w:tc>
+          <w:tcPr>
+            <w:tcW w:type="dxa" w:w="6000"/>
+          </w:tcPr>
+          <w:p>
+            <w:r>
+              <w:rPr>
+                <w:b w:val="false"/>
+                <w:bCs w:val="false"/>
+                <w:color w:val="000000"/>
+                <w:sz w:val="20"/>
+                <w:szCs w:val="20"/>
+              </w:rPr>
+              <w:t xml:space="preserve">http://100.104.206.118/gestion/</w:t>
+            </w:r>
+          </w:p>
+        </w:tc>
+      </w:tr>
+      <w:tr>
+        <w:tc>
+          <w:tcPr>
+            <w:tcW w:type="dxa" w:w="4200"/>
+          </w:tcPr>
+          <w:p>
+            <w:r>
+              <w:rPr>
+                <w:b w:val="false"/>
+                <w:bCs w:val="false"/>
+                <w:color w:val="000000"/>
+                <w:sz w:val="20"/>
+                <w:szCs w:val="20"/>
+              </w:rPr>
+              <w:t xml:space="preserve">App de gestión de usuarios — acceso local</w:t>
             </w:r>
           </w:p>
         </w:tc>
@@ -2823,7 +3602,7 @@
         <w:rPr>
           <w:color w:val="9C5700"/>
         </w:rPr>
-        <w:t xml:space="preserve">Las contraseñas de servicio (PostgreSQL, pgAdmin) no se incluyen en este documento por buena práctica documental; están registradas en el informe interno del proyecto y deben rotarse antes de cualquier entrega pública o despliegue fuera del laboratorio.</w:t>
+        <w:t xml:space="preserve">Las contraseñas de servicio (PostgreSQL, pgAdmin, usuario admin de la app) no se incluyen en este documento por buena práctica documental — fueron rotadas tras un incidente de exposición al hacer público el repositorio (ver CHANGELOG.md del repo) y quedan registradas solo en el entorno de laboratorio, nunca en documentos que circulan.</w:t>
       </w:r>
     </w:p>
     <w:sectPr>
@@ -3096,6 +3875,12 @@
   </w:num>
   <w:num w:numId="2">
     <w:abstractNumId w:val="3"/>
+    <w:lvlOverride w:ilvl="0">
+      <w:startOverride w:val="1"/>
+    </w:lvlOverride>
+  </w:num>
+  <w:num w:numId="3">
+    <w:abstractNumId w:val="2"/>
     <w:lvlOverride w:ilvl="0">
       <w:startOverride w:val="1"/>
     </w:lvlOverride>

</xml_diff>

<commit_message>
docs: runbook 33, guion de la demo actualizado, ensayo ampliado y documentos formales regenerados
</commit_message>
<xml_diff>
--- a/docs/Runbook_SIGET.docx
+++ b/docs/Runbook_SIGET.docx
@@ -59,7 +59,7 @@
           <w:sz w:val="32"/>
           <w:szCs w:val="32"/>
         </w:rPr>
-        <w:t xml:space="preserve">Runbook técnico</w:t>
+        <w:t xml:space="preserve">Runbook de SIGET</w:t>
       </w:r>
     </w:p>
     <w:p>
@@ -74,7 +74,7 @@
           <w:sz w:val="22"/>
           <w:szCs w:val="22"/>
         </w:rPr>
-        <w:t xml:space="preserve">Paso a paso de lo ejecutado: infraestructura, base de datos, backend, interfaz y verificación (32 secciones)</w:t>
+        <w:t xml:space="preserve">Paso a paso técnico de todo lo ejecutado</w:t>
       </w:r>
     </w:p>
     <w:p>
@@ -19198,6 +19198,339 @@
         <w:t xml:space="preserve">Antes de culpar al servidor por un 401 en el login, comprobar si el código del segundo factor ya se usó en ese intervalo.</w:t>
       </w:r>
     </w:p>
+    <w:p>
+      <w:pPr>
+        <w:pStyle w:val="Heading1"/>
+        <w:keepNext/>
+      </w:pPr>
+      <w:r>
+        <w:t xml:space="preserve">33. Sesiones, registro completo, bloqueo progresivo, respaldos y endurecimiento (22 de octubre de 2026)</w:t>
+      </w:r>
+    </w:p>
+    <w:p>
+      <w:pPr>
+        <w:spacing w:after="140" w:line="288"/>
+        <w:jc w:val="both"/>
+      </w:pPr>
+      <w:r>
+        <w:t xml:space="preserve">Fecha: 22 de octubre de 2026, el día de la demostración. Cada cambio de las VM se aprobó antes y se aplicó con respaldo previo; el detalle de cada hallazgo está en revision-seguridad-2026-10-22.md y el estado de la base en estado-base-de-datos.md.</w:t>
+      </w:r>
+    </w:p>
+    <w:p>
+      <w:pPr>
+        <w:pStyle w:val="Heading2"/>
+        <w:keepNext/>
+      </w:pPr>
+      <w:r>
+        <w:t xml:space="preserve">33.1 Cierre de sesión por inactividad y duración máxima</w:t>
+      </w:r>
+    </w:p>
+    <w:p>
+      <w:pPr>
+        <w:pStyle w:val="ListParagraph"/>
+        <w:numPr>
+          <w:ilvl w:val="0"/>
+          <w:numId w:val="7"/>
+        </w:numPr>
+        <w:spacing w:after="80" w:line="276"/>
+        <w:jc w:val="both"/>
+      </w:pPr>
+      <w:r>
+        <w:t xml:space="preserve">La interfaz avisa a los 9 minutos («¿Sigues ahí?») y cierra a los 10, revocando la sesión en el servidor. Durante el aviso el movimiento no cancela el cierre.</w:t>
+      </w:r>
+    </w:p>
+    <w:p>
+      <w:pPr>
+        <w:pStyle w:val="ListParagraph"/>
+        <w:numPr>
+          <w:ilvl w:val="0"/>
+          <w:numId w:val="7"/>
+        </w:numPr>
+        <w:spacing w:after="80" w:line="276"/>
+        <w:jc w:val="both"/>
+      </w:pPr>
+      <w:r>
+        <w:t xml:space="preserve">El servidor no confía en el navegador: rechaza renovar un refresco con más de 15 minutos (SIGET_REFRESH_MAX_EDAD_SEGUNDOS, evento sesion_cerrada_por_inactividad) y </w:t>
+      </w:r>
+      <w:r>
+        <w:rPr>
+          <w:b/>
+          <w:bCs/>
+        </w:rPr>
+        <w:t xml:space="preserve">cada renovación hereda el vencimiento</w:t>
+      </w:r>
+      <w:r>
+        <w:t xml:space="preserve"> de la sesión original (antes sumaba 8 horas más: una sesión podía prolongarse sin límite). Sin migración. Política pura en backend/apps/autenticacion/politica_sesion.py.</w:t>
+      </w:r>
+    </w:p>
+    <w:p>
+      <w:pPr>
+        <w:pStyle w:val="ListParagraph"/>
+        <w:numPr>
+          <w:ilvl w:val="0"/>
+          <w:numId w:val="7"/>
+        </w:numPr>
+        <w:spacing w:after="80" w:line="276"/>
+        <w:jc w:val="both"/>
+      </w:pPr>
+      <w:r>
+        <w:t xml:space="preserve">Recargar la página devuelve siempre al Inicio (la vista solo vive en memoria).</w:t>
+      </w:r>
+    </w:p>
+    <w:p>
+      <w:pPr>
+        <w:pStyle w:val="ListParagraph"/>
+        <w:numPr>
+          <w:ilvl w:val="0"/>
+          <w:numId w:val="7"/>
+        </w:numPr>
+        <w:spacing w:after="80" w:line="276"/>
+        <w:jc w:val="both"/>
+      </w:pPr>
+      <w:r>
+        <w:t xml:space="preserve">Los límites de tasa usan una caché en archivos compartida entre los 3 procesos de gunicorn (hallazgo H-4).</w:t>
+      </w:r>
+    </w:p>
+    <w:p>
+      <w:pPr>
+        <w:pStyle w:val="ListParagraph"/>
+        <w:numPr>
+          <w:ilvl w:val="0"/>
+          <w:numId w:val="7"/>
+        </w:numPr>
+        <w:spacing w:after="80" w:line="276"/>
+        <w:jc w:val="both"/>
+      </w:pPr>
+      <w:r>
+        <w:t xml:space="preserve">Despliegue: git archive del backend → ejecutar-comando.sh verificar_autenticacion (reconstruye la imagen y prueba contra la base real) → desplegar.sh (interfaz y reinicio ordenado del pod).</w:t>
+      </w:r>
+    </w:p>
+    <w:p>
+      <w:pPr>
+        <w:pStyle w:val="Heading2"/>
+        <w:keepNext/>
+      </w:pPr>
+      <w:r>
+        <w:t xml:space="preserve">33.2 Acceso en dos pasos y registro completo</w:t>
+      </w:r>
+    </w:p>
+    <w:p>
+      <w:pPr>
+        <w:pStyle w:val="ListParagraph"/>
+        <w:numPr>
+          <w:ilvl w:val="0"/>
+          <w:numId w:val="7"/>
+        </w:numPr>
+        <w:spacing w:after="80" w:line="276"/>
+        <w:jc w:val="both"/>
+      </w:pPr>
+      <w:r>
+        <w:t xml:space="preserve">Pantalla de acceso: usuario y contraseña; solo si el servidor acepta la contraseña pide el código (la respuesta mfa_requerido se da únicamente con contraseña válida, así que no delata quién tiene segundo factor).</w:t>
+      </w:r>
+    </w:p>
+    <w:p>
+      <w:pPr>
+        <w:pStyle w:val="ListParagraph"/>
+        <w:numPr>
+          <w:ilvl w:val="0"/>
+          <w:numId w:val="7"/>
+        </w:numPr>
+        <w:spacing w:after="80" w:line="276"/>
+        <w:jc w:val="both"/>
+      </w:pPr>
+      <w:r>
+        <w:rPr>
+          <w:b/>
+          <w:bCs/>
+        </w:rPr>
+        <w:t xml:space="preserve">Migración 008</w:t>
+      </w:r>
+      <w:r>
+        <w:t xml:space="preserve"> (perfil): nombre, apellidos, cédula, fecha de nacimiento, provincia, ciudad y correo. Cédula cifrada (Fernet) y con huella HMAC, con claves derivadas por HKDF; solo app_role lee e inserta; sin UPDATE ni DELETE; el auditor no la ve. Cuenta y perfil en una sola transacción; duplicados responden 409 genérico.</w:t>
+      </w:r>
+    </w:p>
+    <w:p>
+      <w:pPr>
+        <w:pStyle w:val="ListParagraph"/>
+        <w:numPr>
+          <w:ilvl w:val="0"/>
+          <w:numId w:val="7"/>
+        </w:numPr>
+        <w:spacing w:after="80" w:line="276"/>
+        <w:jc w:val="both"/>
+      </w:pPr>
+      <w:r>
+        <w:rPr>
+          <w:b/>
+          <w:bCs/>
+        </w:rPr>
+        <w:t xml:space="preserve">Migración 009</w:t>
+      </w:r>
+      <w:r>
+        <w:t xml:space="preserve">: pgadmin_lectura era miembro de pg_read_all_data (leía hashes de contraseñas y de tokens); ahora tiene SELECT explícito solo sobre lo no sensible.</w:t>
+      </w:r>
+    </w:p>
+    <w:p>
+      <w:pPr>
+        <w:pStyle w:val="ListParagraph"/>
+        <w:numPr>
+          <w:ilvl w:val="0"/>
+          <w:numId w:val="7"/>
+        </w:numPr>
+        <w:spacing w:after="80" w:line="276"/>
+        <w:jc w:val="both"/>
+      </w:pPr>
+      <w:r>
+        <w:t xml:space="preserve">Aplicadas como superusuario del contenedor por el socket local, con respaldo previo: cat 00X.sql | /tmp/psql-contenedor.sh -d tramites_demo -v ON_ERROR_STOP=1.</w:t>
+      </w:r>
+    </w:p>
+    <w:p>
+      <w:pPr>
+        <w:pStyle w:val="Heading2"/>
+        <w:keepNext/>
+      </w:pPr>
+      <w:r>
+        <w:t xml:space="preserve">33.3 Bloqueo progresivo</w:t>
+      </w:r>
+    </w:p>
+    <w:p>
+      <w:pPr>
+        <w:spacing w:after="140" w:line="288"/>
+        <w:jc w:val="both"/>
+      </w:pPr>
+      <w:r>
+        <w:t xml:space="preserve">3 fallos (contraseña o código) bloquean 5 minutos; el siguiente bloqueo, 15; los demás, 60. El escalón se calcula con los eventos cuenta_bloqueada desde el último login_ok (memoria de 24 h), sin columnas nuevas. Un inicio de sesión correcto reinicia la escalera. verificar_autenticacion lo prueba con el reloj controlado.</w:t>
+      </w:r>
+    </w:p>
+    <w:p>
+      <w:pPr>
+        <w:pStyle w:val="Heading2"/>
+        <w:keepNext/>
+      </w:pPr>
+      <w:r>
+        <w:t xml:space="preserve">33.4 Respaldos automáticos con prueba de restauración</w:t>
+      </w:r>
+    </w:p>
+    <w:p>
+      <w:pPr>
+        <w:spacing w:after="140" w:line="288"/>
+        <w:jc w:val="both"/>
+      </w:pPr>
+      <w:r>
+        <w:t xml:space="preserve">infra/podman/vm2-db-server/respaldo/ → siget-respaldo.timer (02:30 diario, Persistent=true) y siget-respaldo.sh: pg_dump + roles, comprueba las tablas, </w:t>
+      </w:r>
+      <w:r>
+        <w:rPr>
+          <w:b/>
+          <w:bCs/>
+        </w:rPr>
+        <w:t xml:space="preserve">restaura en una base desechable y compara con la viva</w:t>
+      </w:r>
+      <w:r>
+        <w:t xml:space="preserve">, huella SHA-256, retención de 14 días (mínimo 3; los manuales pre-* no se tocan), archivos 600 en carpeta 700. Estado: systemctl list-timers siget-respaldo.timer; si el último falló, systemctl is-failed siget-respaldo.service dice failed. Pendiente: copia fuera de VM2.</w:t>
+      </w:r>
+    </w:p>
+    <w:p>
+      <w:pPr>
+        <w:pStyle w:val="Heading2"/>
+        <w:keepNext/>
+      </w:pPr>
+      <w:r>
+        <w:t xml:space="preserve">33.5 Endurecimiento aplicado</w:t>
+      </w:r>
+    </w:p>
+    <w:p>
+      <w:pPr>
+        <w:spacing w:after="140" w:line="288"/>
+        <w:jc w:val="both"/>
+      </w:pPr>
+      <w:r>
+        <w:t xml:space="preserve">SSH en las dos VM (/etc/ssh/sshd_config.d/00-siget-endurecimiento.conf: sin root, sin X11, 3 intentos; validado con sshd -t, recarga sin cortar sesiones y reconexión probada). PostgreSQL con log_connections y log_disconnections activos (ALTER SYSTEM + pg_reload_conf()).</w:t>
+      </w:r>
+    </w:p>
+    <w:p>
+      <w:pPr>
+        <w:pStyle w:val="Heading2"/>
+        <w:keepNext/>
+      </w:pPr>
+      <w:r>
+        <w:t xml:space="preserve">33.6 Verificación</w:t>
+      </w:r>
+    </w:p>
+    <w:p>
+      <w:pPr>
+        <w:spacing w:after="140" w:line="288"/>
+        <w:jc w:val="both"/>
+      </w:pPr>
+      <w:r>
+        <w:t xml:space="preserve">verificar_autenticacion 71 de 71 contra la base real; verificar_politicas 39 de 39; ensayo 59 de 59 contra producción; 415 pruebas del backend y 141 del frontend; pip-audit y npm audit sin vulnerabilidades.</w:t>
+      </w:r>
+    </w:p>
+    <w:p>
+      <w:pPr>
+        <w:pStyle w:val="Heading2"/>
+        <w:keepNext/>
+      </w:pPr>
+      <w:r>
+        <w:t xml:space="preserve">33.7 Gotchas</w:t>
+      </w:r>
+    </w:p>
+    <w:p>
+      <w:pPr>
+        <w:pStyle w:val="ListParagraph"/>
+        <w:numPr>
+          <w:ilvl w:val="0"/>
+          <w:numId w:val="7"/>
+        </w:numPr>
+        <w:spacing w:after="80" w:line="276"/>
+        <w:jc w:val="both"/>
+      </w:pPr>
+      <w:r>
+        <w:t xml:space="preserve">Los archivos del repositorio mezclan finales de línea (CRLF/LF): al editar con scripts hay que respetar el existente, o los reemplazos multilínea no coinciden.</w:t>
+      </w:r>
+    </w:p>
+    <w:p>
+      <w:pPr>
+        <w:pStyle w:val="ListParagraph"/>
+        <w:numPr>
+          <w:ilvl w:val="0"/>
+          <w:numId w:val="7"/>
+        </w:numPr>
+        <w:spacing w:after="80" w:line="276"/>
+        <w:jc w:val="both"/>
+      </w:pPr>
+      <w:r>
+        <w:t xml:space="preserve">Un dnf updateinfo sin --assumeno por SSH pide confirmación y se traga el resto del script.</w:t>
+      </w:r>
+    </w:p>
+    <w:p>
+      <w:pPr>
+        <w:pStyle w:val="ListParagraph"/>
+        <w:numPr>
+          <w:ilvl w:val="0"/>
+          <w:numId w:val="7"/>
+        </w:numPr>
+        <w:spacing w:after="80" w:line="276"/>
+        <w:jc w:val="both"/>
+      </w:pPr>
+      <w:r>
+        <w:t xml:space="preserve">tar en Git Bash interpreta C: como un host remoto: usar --force-local.</w:t>
+      </w:r>
+    </w:p>
+    <w:p>
+      <w:pPr>
+        <w:pStyle w:val="ListParagraph"/>
+        <w:numPr>
+          <w:ilvl w:val="0"/>
+          <w:numId w:val="7"/>
+        </w:numPr>
+        <w:spacing w:after="80" w:line="276"/>
+        <w:jc w:val="both"/>
+      </w:pPr>
+      <w:r>
+        <w:t xml:space="preserve">Ver la plataforma nueva en https://…:8443; el puerto 80 sigue siendo el checkpoint PHP antiguo.</w:t>
+      </w:r>
+    </w:p>
     <w:sectPr>
       <w:headerReference w:type="default" r:id="rId6"/>
       <w:footerReference w:type="default" r:id="rId7"/>
@@ -19331,7 +19664,7 @@
         <w:sz w:val="16"/>
         <w:szCs w:val="16"/>
       </w:rPr>
-      <w:t xml:space="preserve">SIGET — Runbook técnico</w:t>
+      <w:t xml:space="preserve">SIGET · Runbook</w:t>
     </w:r>
   </w:p>
 </w:hdr>

</xml_diff>

<commit_message>
docs: consolas de plataforma, recuperacion de contrasena, runbook 34, guion y ensayo de 86 comprobaciones
</commit_message>
<xml_diff>
--- a/docs/Runbook_SIGET.docx
+++ b/docs/Runbook_SIGET.docx
@@ -19531,6 +19531,158 @@
         <w:t xml:space="preserve">Ver la plataforma nueva en https://…:8443; el puerto 80 sigue siendo el checkpoint PHP antiguo.</w:t>
       </w:r>
     </w:p>
+    <w:p>
+      <w:pPr>
+        <w:pStyle w:val="Heading1"/>
+        <w:keepNext/>
+      </w:pPr>
+      <w:r>
+        <w:t xml:space="preserve">34. Consolas de plataforma, control dual y recuperación de contraseña (22 de octubre de 2026)</w:t>
+      </w:r>
+    </w:p>
+    <w:p>
+      <w:pPr>
+        <w:pStyle w:val="Heading2"/>
+        <w:keepNext/>
+      </w:pPr>
+      <w:r>
+        <w:t xml:space="preserve">34.1 Qué se construyó</w:t>
+      </w:r>
+    </w:p>
+    <w:p>
+      <w:pPr>
+        <w:spacing w:after="140" w:line="288"/>
+        <w:jc w:val="both"/>
+      </w:pPr>
+      <w:r>
+        <w:t xml:space="preserve">Backend en backend/apps/plataforma/ (modelos, servicio.py, vistas.py, secretos.py), recuperación pública en backend/apps/autenticacion/restablecimiento.py y servicio.py, interfaz en frontend/src/Plataforma.jsx. Detalle de las rutas en api.md. Las consolas reutilizan las acciones del PDP (proponer_alta, aprobar_alta, restablecer_mfa, bloquear_cuenta, revocar_sesion, rotar_secretos, administrar_infraestructura): no cambió la matriz de permisos.</w:t>
+      </w:r>
+    </w:p>
+    <w:p>
+      <w:pPr>
+        <w:pStyle w:val="Heading2"/>
+        <w:keepNext/>
+      </w:pPr>
+      <w:r>
+        <w:t xml:space="preserve">34.2 Migración 010 y despliegue</w:t>
+      </w:r>
+    </w:p>
+    <w:p>
+      <w:pPr>
+        <w:spacing w:after="140" w:line="288"/>
+        <w:jc w:val="both"/>
+      </w:pPr>
+      <w:r>
+        <w:t xml:space="preserve">Respaldo previo (systemctl start siget-respaldo.service), después cat database/migraciones/010-plataforma-y-restablecimiento.sql | /tmp/psql-contenedor.sh -d tramites_demo -v ON_ERROR_STOP=1 en VM2. En VM1: ejecutar-comando.sh con verificar_plataforma, verificar_autenticacion y verificar_politicas (79, 71 y 39 pasos), y desplegar.sh. </w:t>
+      </w:r>
+      <w:r>
+        <w:rPr>
+          <w:b/>
+          <w:bCs/>
+        </w:rPr>
+        <w:t xml:space="preserve">nginx.conf ahora incluye plataforma</w:t>
+      </w:r>
+      <w:r>
+        <w:t xml:space="preserve"> en la lista de prefijos que llegan al backend. Ojo: desplegar.sh copia la unidad del repositorio y devuelve la inactividad a 10 minutos; para la demo se vuelve a poner SIGET_INACTIVIDAD_MINUTOS=2.</w:t>
+      </w:r>
+    </w:p>
+    <w:p>
+      <w:pPr>
+        <w:pStyle w:val="Heading2"/>
+        <w:keepNext/>
+      </w:pPr>
+      <w:r>
+        <w:t xml:space="preserve">34.3 Operadores adicionales</w:t>
+      </w:r>
+    </w:p>
+    <w:p>
+      <w:pPr>
+        <w:spacing w:after="140" w:line="288"/>
+        <w:jc w:val="both"/>
+      </w:pPr>
+      <w:r>
+        <w:t xml:space="preserve">El control dual necesita dos personas por rol: sembrar_demo creó irene.identidades y camilo.catalogo (sus credenciales viven solo en demo-local/).</w:t>
+      </w:r>
+    </w:p>
+    <w:p>
+      <w:pPr>
+        <w:pStyle w:val="Heading2"/>
+        <w:keepNext/>
+      </w:pPr>
+      <w:r>
+        <w:t xml:space="preserve">34.4 Verificación</w:t>
+      </w:r>
+    </w:p>
+    <w:p>
+      <w:pPr>
+        <w:spacing w:after="140" w:line="288"/>
+        <w:jc w:val="both"/>
+      </w:pPr>
+      <w:r>
+        <w:t xml:space="preserve">verificar_plataforma recorre contra la base real (en una transacción que se revierte): quién entra a cada consola, el ciclo completo del código (emisión, hash en la base, uso, reuso, vencimiento a los 16 minutos, mensajes idénticos), la separación de funciones, el control dual en el motor y en la base, bloqueos, secretos de solo inserción, infraestructura con TLS 1.3, privilegios de la base por rol y los eventos de seguridad. El ensayo de la demo (demo/ensayo.py, sección 10) repite lo no destructivo contra producción: </w:t>
+      </w:r>
+      <w:r>
+        <w:rPr>
+          <w:b/>
+          <w:bCs/>
+        </w:rPr>
+        <w:t xml:space="preserve">86 de 86</w:t>
+      </w:r>
+      <w:r>
+        <w:t xml:space="preserve">.</w:t>
+      </w:r>
+    </w:p>
+    <w:p>
+      <w:pPr>
+        <w:pStyle w:val="Heading2"/>
+        <w:keepNext/>
+      </w:pPr>
+      <w:r>
+        <w:t xml:space="preserve">34.5 Gotchas</w:t>
+      </w:r>
+    </w:p>
+    <w:p>
+      <w:pPr>
+        <w:pStyle w:val="ListParagraph"/>
+        <w:numPr>
+          <w:ilvl w:val="0"/>
+          <w:numId w:val="7"/>
+        </w:numPr>
+        <w:spacing w:after="80" w:line="276"/>
+        <w:jc w:val="both"/>
+      </w:pPr>
+      <w:r>
+        <w:t xml:space="preserve">Una anotación de Django no puede llamarse igual que una relación inversa del modelo (sesiones): daba un 500.</w:t>
+      </w:r>
+    </w:p>
+    <w:p>
+      <w:pPr>
+        <w:pStyle w:val="ListParagraph"/>
+        <w:numPr>
+          <w:ilvl w:val="0"/>
+          <w:numId w:val="7"/>
+        </w:numPr>
+        <w:spacing w:after="80" w:line="276"/>
+        <w:jc w:val="both"/>
+      </w:pPr>
+      <w:r>
+        <w:t xml:space="preserve">El límite de inicios de sesión (10 por minuto por IP) corta un ensayo con muchas cuentas: el script espera un minuto antes de la sección 10.</w:t>
+      </w:r>
+    </w:p>
+    <w:p>
+      <w:pPr>
+        <w:pStyle w:val="ListParagraph"/>
+        <w:numPr>
+          <w:ilvl w:val="0"/>
+          <w:numId w:val="7"/>
+        </w:numPr>
+        <w:spacing w:after="80" w:line="276"/>
+        <w:jc w:val="both"/>
+      </w:pPr>
+      <w:r>
+        <w:t xml:space="preserve">Una corrida interrumpida del ensayo deja una propuesta pendiente; el script la rechaza al empezar.</w:t>
+      </w:r>
+    </w:p>
     <w:sectPr>
       <w:headerReference w:type="default" r:id="rId6"/>
       <w:footerReference w:type="default" r:id="rId7"/>

</xml_diff>

<commit_message>
docs: gestion del equipo, guion y ensayo de 97 comprobaciones
</commit_message>
<xml_diff>
--- a/docs/Runbook_SIGET.docx
+++ b/docs/Runbook_SIGET.docx
@@ -19638,6 +19638,34 @@
         <w:keepNext/>
       </w:pPr>
       <w:r>
+        <w:t xml:space="preserve">34.4b Gestión del equipo (migración 011)</w:t>
+      </w:r>
+    </w:p>
+    <w:p>
+      <w:pPr>
+        <w:spacing w:after="140" w:line="288"/>
+        <w:jc w:val="both"/>
+      </w:pPr>
+      <w:r>
+        <w:t xml:space="preserve">Respaldo previo y cat database/migraciones/011-equipo-institucion.sql | /tmp/psql-contenedor.sh -d tramites_demo -v ON_ERROR_STOP=1. Backend: apps/identidad/equipo.py y las vistas de /equipo/&lt;institucion&gt;/miembros/…. Verificación: verificar_equipo (51 pasos) más regresión de todas las demás. El manager Membresia.objects filtra las revocadas: </w:t>
+      </w:r>
+      <w:r>
+        <w:rPr>
+          <w:b/>
+          <w:bCs/>
+        </w:rPr>
+        <w:t xml:space="preserve">todo código nuevo que decida accesos debe usarlo</w:t>
+      </w:r>
+      <w:r>
+        <w:t xml:space="preserve"> (no Membresia.todas).</w:t>
+      </w:r>
+    </w:p>
+    <w:p>
+      <w:pPr>
+        <w:pStyle w:val="Heading2"/>
+        <w:keepNext/>
+      </w:pPr>
+      <w:r>
         <w:t xml:space="preserve">34.5 Gotchas</w:t>
       </w:r>
     </w:p>

</xml_diff>